<commit_message>
added diary reg year
</commit_message>
<xml_diff>
--- a/public/document.docx
+++ b/public/document.docx
@@ -62,16 +62,7 @@
           <w:szCs w:val="22"/>
           <w:lang w:val="en-IN"/>
         </w:rPr>
-        <w:t>{anr}/</w:t>
-      </w:r>
-      <w:r>
-        <w:rPr>
-          <w:rFonts w:cs="Bookman Old Style" w:ascii="Bookman Old Style" w:hAnsi="Bookman Old Style"/>
-          <w:sz w:val="22"/>
-          <w:szCs w:val="22"/>
-          <w:lang w:val="en-IN"/>
-        </w:rPr>
-        <w:t>{anr_year}</w:t>
+        <w:t>{anr}/{anr_year}</w:t>
       </w:r>
     </w:p>
     <w:p>
@@ -263,7 +254,16 @@
           <w:szCs w:val="22"/>
           <w:lang w:val="en-IN"/>
         </w:rPr>
-        <w:t>{diary}</w:t>
+        <w:t>{diary}/</w:t>
+      </w:r>
+      <w:r>
+        <w:rPr>
+          <w:rFonts w:cs="Bookman Old Style" w:ascii="Bookman Old Style" w:hAnsi="Bookman Old Style"/>
+          <w:sz w:val="22"/>
+          <w:szCs w:val="22"/>
+          <w:lang w:val="en-IN"/>
+        </w:rPr>
+        <w:t>{diary_reg_year}</w:t>
       </w:r>
       <w:r>
         <w:rPr>

</xml_diff>